<commit_message>
Ship settings: final DPA values, Terms §10, functions in arn1 (Stockholm), delete protection on, backups stated as not in place
</commit_message>
<xml_diff>
--- a/public/trust/abrahammoses-dpa-template-v1.0.docx
+++ b/public/trust/abrahammoses-dpa-template-v1.0.docx
@@ -58,7 +58,7 @@
           <w:color w:val="545C6B"/>
           <w:sz w:val="18"/>
         </w:rPr>
-        <w:t>Template version 1.0, 21 October 2026. Square brackets mark what the parties complete or agree.</w:t>
+        <w:t>Template version 1.0, 21 October 2026. Square brackets mark what the parties complete.</w:t>
       </w:r>
     </w:p>
     <w:p>
@@ -410,7 +410,7 @@
         <w:tab/>
       </w:r>
       <w:r>
-        <w:t>The Processor gives the Customer at least [30] days’ written notice before adding or replacing a sub-processor. The Customer may object on reasonable data-protection grounds within that period; if the parties cannot resolve the objection, the Customer may terminate the affected service and receive a pro-rata refund of prepaid fees for it.</w:t>
+        <w:t>The Processor gives the Customer at least 30 days’ written notice before adding or replacing a sub-processor. The Customer may object on reasonable data-protection grounds within that period; if the parties cannot resolve the objection, the Customer may terminate the affected service and receive a pro-rata refund of prepaid fees for it.</w:t>
       </w:r>
     </w:p>
     <w:p>
@@ -485,7 +485,7 @@
         <w:tab/>
       </w:r>
       <w:r>
-        <w:t>The Processor notifies the Customer without undue delay, and in any event within [48] hours, after becoming aware of a personal data breach affecting the Customer’s personal data. The notice describes, as far as then known, the nature of the breach, the categories and approximate number of data subjects and records concerned, the likely consequences and the measures taken or proposed. Information not available at first is provided in phases as it becomes available.</w:t>
+        <w:t>The Processor notifies the Customer without undue delay, and in any event within 48 hours, after becoming aware of a personal data breach affecting the Customer’s personal data. The notice describes, as far as then known, the nature of the breach, the categories and approximate number of data subjects and records concerned, the likely consequences and the measures taken or proposed. Information not available at first is provided in phases as it becomes available.</w:t>
       </w:r>
     </w:p>
     <w:p>
@@ -545,7 +545,7 @@
         <w:tab/>
       </w:r>
       <w:r>
-        <w:t>At the end of the services, at the Customer’s choice, the Processor returns the Customer’s personal data in a machine-readable format and deletes it, within [30] days, unless EU or Member State law requires storage. The Processor confirms the deletion in writing.</w:t>
+        <w:t>At the end of the services, at the Customer’s choice, the Processor returns the Customer’s personal data in a machine-readable format and deletes it, within 30 days, unless EU or Member State law requires storage. The Processor confirms the deletion in writing.</w:t>
       </w:r>
     </w:p>
     <w:p>
@@ -620,7 +620,7 @@
         <w:tab/>
       </w:r>
       <w:r>
-        <w:t>The Processor allows for and contributes to audits, including inspections, by the Customer or an auditor it mandates who is bound by confidentiality, on at least [30] days’ written notice, during normal business hours, no more than once a year unless a personal data breach or a supervisory authority requires otherwise. Each party bears its own costs.</w:t>
+        <w:t>The Processor allows for and contributes to audits, including inspections, by the Customer or an auditor it mandates who is bound by confidentiality, on at least 30 days’ written notice, during normal business hours, no more than once a year unless a personal data breach or a supervisory authority requires otherwise. Each party bears its own costs.</w:t>
       </w:r>
     </w:p>
     <w:p>
@@ -665,7 +665,7 @@
         <w:tab/>
       </w:r>
       <w:r>
-        <w:t>Some sub-processors in Annex 3 process personal data in the United States, including the hosting provider’s server functions (iad1), Firebase Authentication and, when the Deep Analysis AI layer is used, OpenAI. The workspace database is located in the EEA (eur3).</w:t>
+        <w:t>The hosting provider’s server functions run in Stockholm, Sweden (EU), Vercel region arn1, and the workspace database is located in the EEA (eur3). Some sub-processors in Annex 3 process personal data in the United States: Firebase Authentication (account records) and, when the Deep Analysis AI layer is used, OpenAI. The hosting provider and Stripe are also established in or have affiliates in the United States.</w:t>
       </w:r>
     </w:p>
     <w:p>
@@ -1377,7 +1377,7 @@
               <w:rPr>
                 <w:sz w:val="19"/>
               </w:rPr>
-              <w:t>No ISO/IEC 27001 certification, no SOC 2 report, no external penetration test, no database backups or point-in-time recovery, and a single operator without a second person on call.</w:t>
+              <w:t>No ISO/IEC 27001 certification, no SOC 2 report, no external penetration test, no database backups or point-in-time recovery (delete protection on the database is enabled), and a single operator without a second person on call.</w:t>
             </w:r>
           </w:p>
         </w:tc>
@@ -1507,7 +1507,7 @@
               <w:rPr>
                 <w:sz w:val="19"/>
               </w:rPr>
-              <w:t>Server functions: iad1, Washington, D.C., United States (AWS us-east-1). Static pages: Vercel’s global edge network.</w:t>
+              <w:t>Server functions: Stockholm, Sweden (EU), Vercel region arn1. Static pages: Vercel’s global edge network.</w:t>
             </w:r>
           </w:p>
         </w:tc>

</xml_diff>